<commit_message>
Please provide the specific changes or the diff for the files you would like me to summarize.
</commit_message>
<xml_diff>
--- a/iuh/môn/hk1-4/cc-web-website-hld/btl/Báo Cáo Thực Hành.docx
+++ b/iuh/môn/hk1-4/cc-web-website-hld/btl/Báo Cáo Thực Hành.docx
@@ -1015,10 +1015,8 @@
             <w:r>
               <w:rPr>
                 <w:sz w:val="30"/>
-                <w:szCs w:val="30"/>
-                <w:rtl w:val="0"/>
-              </w:rPr>
-              <w:t xml:space="preserve">Nguyễn Thị Ngọc Lan</w:t>
+              </w:rPr>
+              <w:t>Hoàng Đại Dương</w:t>
             </w:r>
           </w:p>
         </w:tc>
@@ -1034,10 +1032,8 @@
             <w:r>
               <w:rPr>
                 <w:sz w:val="30"/>
-                <w:szCs w:val="30"/>
-                <w:rtl w:val="0"/>
-              </w:rPr>
-              <w:t xml:space="preserve">23001235</w:t>
+              </w:rPr>
+              <w:t>24743991</w:t>
             </w:r>
           </w:p>
         </w:tc>
@@ -1060,10 +1056,8 @@
             <w:r>
               <w:rPr>
                 <w:sz w:val="30"/>
-                <w:szCs w:val="30"/>
-                <w:rtl w:val="0"/>
-              </w:rPr>
-              <w:t xml:space="preserve">Lê Duy Phúc</w:t>
+              </w:rPr>
+              <w:t>Nguyễn Trung Dũng</w:t>
             </w:r>
           </w:p>
         </w:tc>
@@ -1079,10 +1073,8 @@
             <w:r>
               <w:rPr>
                 <w:sz w:val="30"/>
-                <w:szCs w:val="30"/>
-                <w:rtl w:val="0"/>
-              </w:rPr>
-              <w:t xml:space="preserve">23708271</w:t>
+              </w:rPr>
+              <w:t>24000905</w:t>
             </w:r>
           </w:p>
         </w:tc>
@@ -1105,10 +1097,8 @@
             <w:r>
               <w:rPr>
                 <w:sz w:val="30"/>
-                <w:szCs w:val="30"/>
-                <w:rtl w:val="0"/>
-              </w:rPr>
-              <w:t xml:space="preserve">Nguyễn Vũ Nhật Hào</w:t>
+              </w:rPr>
+              <w:t>Lê Thành Long</w:t>
             </w:r>
           </w:p>
         </w:tc>
@@ -1124,10 +1114,8 @@
             <w:r>
               <w:rPr>
                 <w:sz w:val="30"/>
-                <w:szCs w:val="30"/>
-                <w:rtl w:val="0"/>
-              </w:rPr>
-              <w:t xml:space="preserve">23654771</w:t>
+              </w:rPr>
+              <w:t>23630851</w:t>
             </w:r>
           </w:p>
         </w:tc>

</xml_diff>